<commit_message>
Sync downloadable resume files with latest version
The linked PDF and the docx source were both stale: missing the Helson
Software Solutions work history, using the old .unt.edu email, and still
describing the degree as in progress. The docx summary also claimed
"no internship yet", which no longer reflects 3+ years of experience.
</commit_message>
<xml_diff>
--- a/Saketh_Papareddy_Resume.docx
+++ b/Saketh_Papareddy_Resume.docx
@@ -31,7 +31,7 @@
           <w:sz w:val="20"/>
           <w:szCs w:val="20"/>
         </w:rPr>
-        <w:t xml:space="preserve">Denton, TX 76207  |  (940) 334-6475  |  sakethpapareddy@my.unt.edu</w:t>
+        <w:t xml:space="preserve">Denton, TX 76207  |  (940) 334-6475  |  sakethpapareddy@gmail.com</w:t>
       </w:r>
     </w:p>
     <w:p>
@@ -46,7 +46,7 @@
           <w:sz w:val="20"/>
           <w:szCs w:val="20"/>
         </w:rPr>
-        <w:t xml:space="preserve">linkedin.com/in/saketh-papareddy  |  github.com/Papareddy-saketh</w:t>
+        <w:t xml:space="preserve">linkedin.com/in/saketh-papareddy  |  github.com/Papareddy-saketh  |  papareddy-saketh.github.io</w:t>
       </w:r>
     </w:p>
     <w:p>
@@ -79,7 +79,7 @@
           <w:sz w:val="21"/>
           <w:szCs w:val="21"/>
         </w:rPr>
-        <w:t xml:space="preserve">ML Engineer (MS AI, UNT) with 3 deployed end-to-end systems — a generative RAG pipeline (17x latency reduction), a dual-model sales forecaster (FastAPI + Flask), and an XGBoost recommendation engine (NDCG@5: 0.927). No internship yet; every project is built, evaluated, and shipped to mirror production ML work. Azure-certified.</w:t>
+        <w:t xml:space="preserve">MS AI graduate (UNT, May 2026) with 3+ years of professional experience building AI products at an IT consulting firm and hands-on expertise in end-to-end LLM application development. Delivered chatbot and NLP solutions across finance and enterprise domains, and independently built a hybrid RAG pipeline (FAISS + BM25 + cross-encoder reranking) with 17× latency improvement, a 6-class query router, and hallucination filtering via n-gram grounding. Focused on applied AI systems — from prototyping and evaluation to reliable deployment at scale.</w:t>
       </w:r>
     </w:p>
     <w:p>
@@ -173,7 +173,7 @@
           <w:sz w:val="21"/>
           <w:szCs w:val="21"/>
         </w:rPr>
-        <w:t xml:space="preserve">LangChain, FAISS, BM25, Sentence Transformers, Groq API, Llama 3.3 70B, Mistral-7B (4-bit)</w:t>
+        <w:t xml:space="preserve">LangChain, FAISS, BM25, Sentence Transformers, Groq API, Llama 3.3 70B, Mistral-7B (4-bit), Prompt Engineering, RAG</w:t>
       </w:r>
     </w:p>
     <w:p>
@@ -242,7 +242,7 @@
           <w:sz w:val="24"/>
           <w:szCs w:val="24"/>
         </w:rPr>
-        <w:t xml:space="preserve">PROJECTS</w:t>
+        <w:t xml:space="preserve">WORK EXPERIENCE</w:t>
       </w:r>
     </w:p>
     <w:p>
@@ -261,7 +261,41 @@
           <w:sz w:val="22"/>
           <w:szCs w:val="22"/>
         </w:rPr>
-        <w:t xml:space="preserve">Generative RAG Pipeline with Hybrid Retrieval &amp; LLM Generation</w:t>
+        <w:t xml:space="preserve">Helson Software Solutions Pvt. Ltd.</w:t>
+      </w:r>
+      <w:r>
+        <w:rPr>
+          <w:rFonts w:ascii="Calibri" w:cs="Calibri" w:eastAsia="Calibri" w:hAnsi="Calibri"/>
+        </w:rPr>
+        <w:t xml:space="preserve">	</w:t>
+      </w:r>
+      <w:r>
+        <w:rPr>
+          <w:rFonts w:ascii="Calibri" w:cs="Calibri" w:eastAsia="Calibri" w:hAnsi="Calibri"/>
+          <w:color w:val="333333"/>
+          <w:sz w:val="21"/>
+          <w:szCs w:val="21"/>
+        </w:rPr>
+        <w:t xml:space="preserve">Hyderabad, India</w:t>
+      </w:r>
+    </w:p>
+    <w:p>
+      <w:pPr>
+        <w:tabs>
+          <w:tab w:val="right" w:pos="9026"/>
+        </w:tabs>
+        <w:spacing w:after="40" w:before="80"/>
+      </w:pPr>
+      <w:r>
+        <w:rPr>
+          <w:rFonts w:ascii="Calibri" w:cs="Calibri" w:eastAsia="Calibri" w:hAnsi="Calibri"/>
+          <w:b/>
+          <w:bCs/>
+          <w:color w:val="1A1A1A"/>
+          <w:sz w:val="21"/>
+          <w:szCs w:val="21"/>
+        </w:rPr>
+        <w:t xml:space="preserve">AI Engineer</w:t>
       </w:r>
       <w:r>
         <w:rPr>
@@ -278,7 +312,7 @@
           <w:sz w:val="21"/>
           <w:szCs w:val="21"/>
         </w:rPr>
-        <w:t xml:space="preserve">Python, LangChain, FAISS, BM25, Groq, Llama 3.3 70B, Streamlit</w:t>
+        <w:t xml:space="preserve">Feb 2022 – Jun 2024</w:t>
       </w:r>
     </w:p>
     <w:p>
@@ -297,7 +331,7 @@
           <w:sz w:val="21"/>
           <w:szCs w:val="21"/>
         </w:rPr>
-        <w:t xml:space="preserve">Built a PDF Q&amp;A system using Llama 3.3 70B (Groq API) with Mistral-7B local fallback, cutting response time from ~45s to 2.6s (17x faster).</w:t>
+        <w:t xml:space="preserve">Developed chatbot solutions for 3–4 finance and business clients using OpenAI GPT-3.5/4 API and early LangChain, building prompt chains and conversation memory to handle domain-specific client queries.</w:t>
       </w:r>
     </w:p>
     <w:p>
@@ -316,7 +350,7 @@
           <w:sz w:val="21"/>
           <w:szCs w:val="21"/>
         </w:rPr>
-        <w:t xml:space="preserve">Implemented hybrid retrieval (FAISS + BM25 + cross-encoder reranking) and a 6-class query router — 90% classification accuracy, 100% out-of-scope rejection.</w:t>
+        <w:t xml:space="preserve">Integrated semantic search using FAISS and sentence-transformers for document retrieval; fine-tuned Hugging Face models for text classification tasks across fintech and enterprise client projects.</w:t>
       </w:r>
     </w:p>
     <w:p>
@@ -335,7 +369,7 @@
           <w:sz w:val="21"/>
           <w:szCs w:val="21"/>
         </w:rPr>
-        <w:t xml:space="preserve">Validated against 48 questions on a 176-page technical document; achieved F1=0.51 with hallucination filtering via n-gram overlap grounding.</w:t>
+        <w:t xml:space="preserve">Deployed AI models as REST APIs using FastAPI and Flask, applied prompt engineering to improve output quality, and iterated on model behavior based on client feedback across multiple deliveries.</w:t>
       </w:r>
     </w:p>
     <w:p>
@@ -343,18 +377,18 @@
         <w:tabs>
           <w:tab w:val="right" w:pos="9026"/>
         </w:tabs>
-        <w:spacing w:after="40" w:before="160"/>
-      </w:pPr>
-      <w:r>
-        <w:rPr>
-          <w:rFonts w:ascii="Calibri" w:cs="Calibri" w:eastAsia="Calibri" w:hAnsi="Calibri"/>
-          <w:b/>
-          <w:bCs/>
-          <w:color w:val="1A1A1A"/>
-          <w:sz w:val="22"/>
-          <w:szCs w:val="22"/>
-        </w:rPr>
-        <w:t xml:space="preserve">Retail Store Sales Forecasting Engine</w:t>
+        <w:spacing w:after="40" w:before="80"/>
+      </w:pPr>
+      <w:r>
+        <w:rPr>
+          <w:rFonts w:ascii="Calibri" w:cs="Calibri" w:eastAsia="Calibri" w:hAnsi="Calibri"/>
+          <w:b/>
+          <w:bCs/>
+          <w:color w:val="1A1A1A"/>
+          <w:sz w:val="21"/>
+          <w:szCs w:val="21"/>
+        </w:rPr>
+        <w:t xml:space="preserve">Python Intern</w:t>
       </w:r>
       <w:r>
         <w:rPr>
@@ -371,7 +405,7 @@
           <w:sz w:val="21"/>
           <w:szCs w:val="21"/>
         </w:rPr>
-        <w:t xml:space="preserve">Python, ARIMA, LSTM, TensorFlow, FastAPI, Flask, Pandas</w:t>
+        <w:t xml:space="preserve">Apr 2021 – Feb 2022</w:t>
       </w:r>
     </w:p>
     <w:p>
@@ -390,7 +424,7 @@
           <w:sz w:val="21"/>
           <w:szCs w:val="21"/>
         </w:rPr>
-        <w:t xml:space="preserve">Deployed two forecasting models — ARIMA (RMSE: 0.0722, directional accuracy: 78.57%) via FastAPI and LSTM (RMSLE: 0.2892, directional accuracy: 67.48%) via Flask — both accessible without code.</w:t>
+        <w:t xml:space="preserve">Wrote Python scripts for data cleaning, preprocessing, and automation tasks supporting the software development team across multiple client projects.</w:t>
       </w:r>
     </w:p>
     <w:p>
@@ -409,7 +443,26 @@
           <w:sz w:val="21"/>
           <w:szCs w:val="21"/>
         </w:rPr>
-        <w:t xml:space="preserve">Built a feature pipeline across 5 external signals (oil prices, holidays, promotions, store metadata, transactions) with N-step forecasting and CSV export endpoints.</w:t>
+        <w:t xml:space="preserve">Assisted in building and testing REST APIs using Flask, debugged Python codebases, and contributed to internal tooling used across client engagements.</w:t>
+      </w:r>
+    </w:p>
+    <w:p>
+      <w:pPr>
+        <w:pBdr>
+          <w:bottom w:val="single" w:color="2E5090" w:sz="6" w:space="2"/>
+        </w:pBdr>
+        <w:spacing w:after="80" w:before="240"/>
+      </w:pPr>
+      <w:r>
+        <w:rPr>
+          <w:rFonts w:ascii="Calibri" w:cs="Calibri" w:eastAsia="Calibri" w:hAnsi="Calibri"/>
+          <w:b/>
+          <w:bCs/>
+          <w:color w:val="2E5090"/>
+          <w:sz w:val="24"/>
+          <w:szCs w:val="24"/>
+        </w:rPr>
+        <w:t xml:space="preserve">PROJECTS</w:t>
       </w:r>
     </w:p>
     <w:p>
@@ -428,7 +481,7 @@
           <w:sz w:val="22"/>
           <w:szCs w:val="22"/>
         </w:rPr>
-        <w:t xml:space="preserve">Airbnb Destination Recommendation System</w:t>
+        <w:t xml:space="preserve">Generative RAG Pipeline with Hybrid Retrieval &amp; LLM Generation</w:t>
       </w:r>
       <w:r>
         <w:rPr>
@@ -445,7 +498,7 @@
           <w:sz w:val="21"/>
           <w:szCs w:val="21"/>
         </w:rPr>
-        <w:t xml:space="preserve">Python, XGBoost, Gradient Boosting, Flask, Pandas, Scikit-learn</w:t>
+        <w:t xml:space="preserve">Python, LangChain, FAISS, BM25, Groq API, Llama 3.3 70B, Mistral-7B, Streamlit  |  Live Demo: saketh-papareddy-rag.streamlit.app</w:t>
       </w:r>
     </w:p>
     <w:p>
@@ -464,7 +517,7 @@
           <w:sz w:val="21"/>
           <w:szCs w:val="21"/>
         </w:rPr>
-        <w:t xml:space="preserve">Trained XGBoost on 213K+ user records to rank top-5 destinations (NDCG@5: 0.927), deployed via Flask, and ranked top 15% on Kaggle.</w:t>
+        <w:t xml:space="preserve">Built and deployed a production-grade PDF Q&amp;A system on Streamlit Cloud — end-to-end ownership from prototyping through evaluation to live deployment. Uses Llama 3.3 70B (Groq API) with Mistral-7B local fallback, reducing response latency from ~45s to 2.6s (17× faster).</w:t>
       </w:r>
     </w:p>
     <w:p>
@@ -483,149 +536,7 @@
           <w:sz w:val="21"/>
           <w:szCs w:val="21"/>
         </w:rPr>
-        <w:t xml:space="preserve">Engineered 500+ features from session logs, demographics, and device signals; trained a second Gradient Boosting model (NDCG@5: 0.824) on booking-only users to compare behavior across user segments.</w:t>
-      </w:r>
-    </w:p>
-    <w:p>
-      <w:pPr>
-        <w:pBdr>
-          <w:bottom w:val="single" w:color="2E5090" w:sz="6" w:space="2"/>
-        </w:pBdr>
-        <w:spacing w:after="80" w:before="240"/>
-      </w:pPr>
-      <w:r>
-        <w:rPr>
-          <w:rFonts w:ascii="Calibri" w:cs="Calibri" w:eastAsia="Calibri" w:hAnsi="Calibri"/>
-          <w:b/>
-          <w:bCs/>
-          <w:color w:val="2E5090"/>
-          <w:sz w:val="24"/>
-          <w:szCs w:val="24"/>
-        </w:rPr>
-        <w:t xml:space="preserve">EDUCATION</w:t>
-      </w:r>
-    </w:p>
-    <w:p>
-      <w:pPr>
-        <w:tabs>
-          <w:tab w:val="right" w:pos="9026"/>
-        </w:tabs>
-        <w:spacing w:after="80" w:before="80"/>
-      </w:pPr>
-      <w:r>
-        <w:rPr>
-          <w:rFonts w:ascii="Calibri" w:cs="Calibri" w:eastAsia="Calibri" w:hAnsi="Calibri"/>
-          <w:b/>
-          <w:bCs/>
-          <w:color w:val="1A1A1A"/>
-          <w:sz w:val="21"/>
-          <w:szCs w:val="21"/>
-        </w:rPr>
-        <w:t xml:space="preserve">University of North Texas</w:t>
-      </w:r>
-      <w:r>
-        <w:rPr>
-          <w:rFonts w:ascii="Calibri" w:cs="Calibri" w:eastAsia="Calibri" w:hAnsi="Calibri"/>
-        </w:rPr>
-        <w:t xml:space="preserve">	</w:t>
-      </w:r>
-      <w:r>
-        <w:rPr>
-          <w:rFonts w:ascii="Calibri" w:cs="Calibri" w:eastAsia="Calibri" w:hAnsi="Calibri"/>
-          <w:color w:val="333333"/>
-          <w:sz w:val="21"/>
-          <w:szCs w:val="21"/>
-        </w:rPr>
-        <w:t xml:space="preserve">Denton, TX</w:t>
-      </w:r>
-      <w:r>
-        <w:br/>
-      </w:r>
-      <w:r>
-        <w:rPr>
-          <w:rFonts w:ascii="Calibri" w:cs="Calibri" w:eastAsia="Calibri" w:hAnsi="Calibri"/>
-          <w:color w:val="333333"/>
-          <w:sz w:val="21"/>
-          <w:szCs w:val="21"/>
-        </w:rPr>
-        <w:t xml:space="preserve">Master of Science in Artificial Intelligence</w:t>
-      </w:r>
-      <w:r>
-        <w:br/>
-      </w:r>
-      <w:r>
-        <w:rPr>
-          <w:rFonts w:ascii="Calibri" w:cs="Calibri" w:eastAsia="Calibri" w:hAnsi="Calibri"/>
-          <w:color w:val="333333"/>
-          <w:sz w:val="21"/>
-          <w:szCs w:val="21"/>
-        </w:rPr>
-        <w:t xml:space="preserve">Expected Graduation: May 2026  |  Relevant Coursework: Deep Learning, Machine Learning, Neural Networks, Computer Vision</w:t>
-      </w:r>
-    </w:p>
-    <w:p>
-      <w:pPr>
-        <w:tabs>
-          <w:tab w:val="right" w:pos="9026"/>
-        </w:tabs>
-        <w:spacing w:after="80" w:before="80"/>
-      </w:pPr>
-      <w:r>
-        <w:rPr>
-          <w:rFonts w:ascii="Calibri" w:cs="Calibri" w:eastAsia="Calibri" w:hAnsi="Calibri"/>
-          <w:b/>
-          <w:bCs/>
-          <w:color w:val="1A1A1A"/>
-          <w:sz w:val="21"/>
-          <w:szCs w:val="21"/>
-        </w:rPr>
-        <w:t xml:space="preserve">NBKR Institute of Science &amp; Technology</w:t>
-      </w:r>
-      <w:r>
-        <w:rPr>
-          <w:rFonts w:ascii="Calibri" w:cs="Calibri" w:eastAsia="Calibri" w:hAnsi="Calibri"/>
-        </w:rPr>
-        <w:t xml:space="preserve">	</w:t>
-      </w:r>
-      <w:r>
-        <w:rPr>
-          <w:rFonts w:ascii="Calibri" w:cs="Calibri" w:eastAsia="Calibri" w:hAnsi="Calibri"/>
-          <w:color w:val="333333"/>
-          <w:sz w:val="21"/>
-          <w:szCs w:val="21"/>
-        </w:rPr>
-        <w:t xml:space="preserve">Vidyanagar, A.P., India</w:t>
-      </w:r>
-      <w:r>
-        <w:br/>
-      </w:r>
-      <w:r>
-        <w:rPr>
-          <w:rFonts w:ascii="Calibri" w:cs="Calibri" w:eastAsia="Calibri" w:hAnsi="Calibri"/>
-          <w:color w:val="333333"/>
-          <w:sz w:val="21"/>
-          <w:szCs w:val="21"/>
-        </w:rPr>
-        <w:t xml:space="preserve">Bachelor of Technology in Information Technology</w:t>
-      </w:r>
-    </w:p>
-    <w:p>
-      <w:pPr>
-        <w:pBdr>
-          <w:bottom w:val="single" w:color="2E5090" w:sz="6" w:space="2"/>
-        </w:pBdr>
-        <w:spacing w:after="80" w:before="240"/>
-      </w:pPr>
-      <w:r>
-        <w:rPr>
-          <w:rFonts w:ascii="Calibri" w:cs="Calibri" w:eastAsia="Calibri" w:hAnsi="Calibri"/>
-          <w:b/>
-          <w:bCs/>
-          <w:color w:val="2E5090"/>
-          <w:sz w:val="24"/>
-          <w:szCs w:val="24"/>
-        </w:rPr>
-        <w:t xml:space="preserve">LEADERSHIP &amp; CERTIFICATIONS</w:t>
+        <w:t xml:space="preserve">Implemented hybrid retrieval (FAISS semantic search + BM25 keyword search + cross-encoder reranking) and a 6-class query router built with prompt engineering — 90% classification accuracy, 100% out-of-scope rejection rate.</w:t>
       </w:r>
     </w:p>
     <w:p>
@@ -644,7 +555,297 @@
           <w:sz w:val="21"/>
           <w:szCs w:val="21"/>
         </w:rPr>
-        <w:t xml:space="preserve">Directed 'Inforium', a department-wide technical event at NBKRIST — coordinated 10+ volunteers, owned vendor logistics, and delivered to 200+ attendees on time.</w:t>
+        <w:t xml:space="preserve">Designed and ran structured evaluation on 48 questions across a 176-page technical document; applied n-gram overlap grounding for hallucination filtering, achieving F1=0.51 with zero hallucinated citations on grounded responses.</w:t>
+      </w:r>
+    </w:p>
+    <w:p>
+      <w:pPr>
+        <w:tabs>
+          <w:tab w:val="right" w:pos="9026"/>
+        </w:tabs>
+        <w:spacing w:after="40" w:before="160"/>
+      </w:pPr>
+      <w:r>
+        <w:rPr>
+          <w:rFonts w:ascii="Calibri" w:cs="Calibri" w:eastAsia="Calibri" w:hAnsi="Calibri"/>
+          <w:b/>
+          <w:bCs/>
+          <w:color w:val="1A1A1A"/>
+          <w:sz w:val="22"/>
+          <w:szCs w:val="22"/>
+        </w:rPr>
+        <w:t xml:space="preserve">Retail Store Sales Forecasting Engine</w:t>
+      </w:r>
+      <w:r>
+        <w:rPr>
+          <w:rFonts w:ascii="Calibri" w:cs="Calibri" w:eastAsia="Calibri" w:hAnsi="Calibri"/>
+        </w:rPr>
+        <w:t xml:space="preserve">	</w:t>
+      </w:r>
+      <w:r>
+        <w:rPr>
+          <w:rFonts w:ascii="Calibri" w:cs="Calibri" w:eastAsia="Calibri" w:hAnsi="Calibri"/>
+          <w:i/>
+          <w:iCs/>
+          <w:color w:val="555555"/>
+          <w:sz w:val="21"/>
+          <w:szCs w:val="21"/>
+        </w:rPr>
+        <w:t xml:space="preserve">Python, ARIMA, LSTM, TensorFlow, FastAPI, Flask, Pandas</w:t>
+      </w:r>
+    </w:p>
+    <w:p>
+      <w:pPr>
+        <w:pStyle w:val="ListParagraph"/>
+        <w:numPr>
+          <w:ilvl w:val="0"/>
+          <w:numId w:val="2"/>
+        </w:numPr>
+        <w:spacing w:after="40"/>
+      </w:pPr>
+      <w:r>
+        <w:rPr>
+          <w:rFonts w:ascii="Calibri" w:cs="Calibri" w:eastAsia="Calibri" w:hAnsi="Calibri"/>
+          <w:color w:val="333333"/>
+          <w:sz w:val="21"/>
+          <w:szCs w:val="21"/>
+        </w:rPr>
+        <w:t xml:space="preserve">Built and served two forecasting models — ARIMA (RMSE: 0.0722, directional accuracy: 78.57%) via FastAPI REST API and LSTM (RMSLE: 0.2892, directional accuracy: 67.48%) via Flask — both accessible via web interface without writing code.</w:t>
+      </w:r>
+    </w:p>
+    <w:p>
+      <w:pPr>
+        <w:pStyle w:val="ListParagraph"/>
+        <w:numPr>
+          <w:ilvl w:val="0"/>
+          <w:numId w:val="2"/>
+        </w:numPr>
+        <w:spacing w:after="40"/>
+      </w:pPr>
+      <w:r>
+        <w:rPr>
+          <w:rFonts w:ascii="Calibri" w:cs="Calibri" w:eastAsia="Calibri" w:hAnsi="Calibri"/>
+          <w:color w:val="333333"/>
+          <w:sz w:val="21"/>
+          <w:szCs w:val="21"/>
+        </w:rPr>
+        <w:t xml:space="preserve">Built an end-to-end feature pipeline ingesting 5 external signals (oil prices, holidays, promotions, store metadata, transactions) with N-step forecasting and CSV export endpoints.</w:t>
+      </w:r>
+    </w:p>
+    <w:p>
+      <w:pPr>
+        <w:tabs>
+          <w:tab w:val="right" w:pos="9026"/>
+        </w:tabs>
+        <w:spacing w:after="40" w:before="160"/>
+      </w:pPr>
+      <w:r>
+        <w:rPr>
+          <w:rFonts w:ascii="Calibri" w:cs="Calibri" w:eastAsia="Calibri" w:hAnsi="Calibri"/>
+          <w:b/>
+          <w:bCs/>
+          <w:color w:val="1A1A1A"/>
+          <w:sz w:val="22"/>
+          <w:szCs w:val="22"/>
+        </w:rPr>
+        <w:t xml:space="preserve">Airbnb Destination Recommendation System</w:t>
+      </w:r>
+      <w:r>
+        <w:rPr>
+          <w:rFonts w:ascii="Calibri" w:cs="Calibri" w:eastAsia="Calibri" w:hAnsi="Calibri"/>
+        </w:rPr>
+        <w:t xml:space="preserve">	</w:t>
+      </w:r>
+      <w:r>
+        <w:rPr>
+          <w:rFonts w:ascii="Calibri" w:cs="Calibri" w:eastAsia="Calibri" w:hAnsi="Calibri"/>
+          <w:i/>
+          <w:iCs/>
+          <w:color w:val="555555"/>
+          <w:sz w:val="21"/>
+          <w:szCs w:val="21"/>
+        </w:rPr>
+        <w:t xml:space="preserve">Python, XGBoost, Gradient Boosting, Flask, Pandas, Scikit-learn</w:t>
+      </w:r>
+    </w:p>
+    <w:p>
+      <w:pPr>
+        <w:pStyle w:val="ListParagraph"/>
+        <w:numPr>
+          <w:ilvl w:val="0"/>
+          <w:numId w:val="2"/>
+        </w:numPr>
+        <w:spacing w:after="40"/>
+      </w:pPr>
+      <w:r>
+        <w:rPr>
+          <w:rFonts w:ascii="Calibri" w:cs="Calibri" w:eastAsia="Calibri" w:hAnsi="Calibri"/>
+          <w:color w:val="333333"/>
+          <w:sz w:val="21"/>
+          <w:szCs w:val="21"/>
+        </w:rPr>
+        <w:t xml:space="preserve">Trained XGBoost on 213K+ user records to rank top-5 destinations (NDCG@5: 0.927), served via Flask web app; ranked top 15% on Kaggle.</w:t>
+      </w:r>
+    </w:p>
+    <w:p>
+      <w:pPr>
+        <w:pStyle w:val="ListParagraph"/>
+        <w:numPr>
+          <w:ilvl w:val="0"/>
+          <w:numId w:val="2"/>
+        </w:numPr>
+        <w:spacing w:after="40"/>
+      </w:pPr>
+      <w:r>
+        <w:rPr>
+          <w:rFonts w:ascii="Calibri" w:cs="Calibri" w:eastAsia="Calibri" w:hAnsi="Calibri"/>
+          <w:color w:val="333333"/>
+          <w:sz w:val="21"/>
+          <w:szCs w:val="21"/>
+        </w:rPr>
+        <w:t xml:space="preserve">Engineered 500+ features from session logs, demographics, and device signals; trained a second Gradient Boosting model (NDCG@5: 0.824) on booking-only users to compare behavior across segments.</w:t>
+      </w:r>
+    </w:p>
+    <w:p>
+      <w:pPr>
+        <w:pBdr>
+          <w:bottom w:val="single" w:color="2E5090" w:sz="6" w:space="2"/>
+        </w:pBdr>
+        <w:spacing w:after="80" w:before="240"/>
+      </w:pPr>
+      <w:r>
+        <w:rPr>
+          <w:rFonts w:ascii="Calibri" w:cs="Calibri" w:eastAsia="Calibri" w:hAnsi="Calibri"/>
+          <w:b/>
+          <w:bCs/>
+          <w:color w:val="2E5090"/>
+          <w:sz w:val="24"/>
+          <w:szCs w:val="24"/>
+        </w:rPr>
+        <w:t xml:space="preserve">EDUCATION</w:t>
+      </w:r>
+    </w:p>
+    <w:p>
+      <w:pPr>
+        <w:tabs>
+          <w:tab w:val="right" w:pos="9026"/>
+        </w:tabs>
+        <w:spacing w:after="80" w:before="80"/>
+      </w:pPr>
+      <w:r>
+        <w:rPr>
+          <w:rFonts w:ascii="Calibri" w:cs="Calibri" w:eastAsia="Calibri" w:hAnsi="Calibri"/>
+          <w:b/>
+          <w:bCs/>
+          <w:color w:val="1A1A1A"/>
+          <w:sz w:val="21"/>
+          <w:szCs w:val="21"/>
+        </w:rPr>
+        <w:t xml:space="preserve">University of North Texas</w:t>
+      </w:r>
+      <w:r>
+        <w:rPr>
+          <w:rFonts w:ascii="Calibri" w:cs="Calibri" w:eastAsia="Calibri" w:hAnsi="Calibri"/>
+        </w:rPr>
+        <w:t xml:space="preserve">	</w:t>
+      </w:r>
+      <w:r>
+        <w:rPr>
+          <w:rFonts w:ascii="Calibri" w:cs="Calibri" w:eastAsia="Calibri" w:hAnsi="Calibri"/>
+          <w:color w:val="333333"/>
+          <w:sz w:val="21"/>
+          <w:szCs w:val="21"/>
+        </w:rPr>
+        <w:t xml:space="preserve">Denton, TX</w:t>
+      </w:r>
+      <w:r>
+        <w:br/>
+      </w:r>
+      <w:r>
+        <w:rPr>
+          <w:rFonts w:ascii="Calibri" w:cs="Calibri" w:eastAsia="Calibri" w:hAnsi="Calibri"/>
+          <w:color w:val="333333"/>
+          <w:sz w:val="21"/>
+          <w:szCs w:val="21"/>
+        </w:rPr>
+        <w:t xml:space="preserve">Master of Science in Artificial Intelligence</w:t>
+      </w:r>
+      <w:r>
+        <w:br/>
+      </w:r>
+      <w:r>
+        <w:rPr>
+          <w:rFonts w:ascii="Calibri" w:cs="Calibri" w:eastAsia="Calibri" w:hAnsi="Calibri"/>
+          <w:color w:val="333333"/>
+          <w:sz w:val="21"/>
+          <w:szCs w:val="21"/>
+        </w:rPr>
+        <w:t xml:space="preserve">Graduated: May 2026  |  Relevant Coursework: Deep Learning, Machine Learning, Neural Networks, Computer Vision</w:t>
+      </w:r>
+    </w:p>
+    <w:p>
+      <w:pPr>
+        <w:tabs>
+          <w:tab w:val="right" w:pos="9026"/>
+        </w:tabs>
+        <w:spacing w:after="80" w:before="80"/>
+      </w:pPr>
+      <w:r>
+        <w:rPr>
+          <w:rFonts w:ascii="Calibri" w:cs="Calibri" w:eastAsia="Calibri" w:hAnsi="Calibri"/>
+          <w:b/>
+          <w:bCs/>
+          <w:color w:val="1A1A1A"/>
+          <w:sz w:val="21"/>
+          <w:szCs w:val="21"/>
+        </w:rPr>
+        <w:t xml:space="preserve">NBKR Institute of Science &amp; Technology</w:t>
+      </w:r>
+      <w:r>
+        <w:rPr>
+          <w:rFonts w:ascii="Calibri" w:cs="Calibri" w:eastAsia="Calibri" w:hAnsi="Calibri"/>
+        </w:rPr>
+        <w:t xml:space="preserve">	</w:t>
+      </w:r>
+      <w:r>
+        <w:rPr>
+          <w:rFonts w:ascii="Calibri" w:cs="Calibri" w:eastAsia="Calibri" w:hAnsi="Calibri"/>
+          <w:color w:val="333333"/>
+          <w:sz w:val="21"/>
+          <w:szCs w:val="21"/>
+        </w:rPr>
+        <w:t xml:space="preserve">Vidyanagar, A.P., India</w:t>
+      </w:r>
+      <w:r>
+        <w:br/>
+      </w:r>
+      <w:r>
+        <w:rPr>
+          <w:rFonts w:ascii="Calibri" w:cs="Calibri" w:eastAsia="Calibri" w:hAnsi="Calibri"/>
+          <w:color w:val="333333"/>
+          <w:sz w:val="21"/>
+          <w:szCs w:val="21"/>
+        </w:rPr>
+        <w:t xml:space="preserve">Bachelor of Technology in Information Technology</w:t>
+      </w:r>
+    </w:p>
+    <w:p>
+      <w:pPr>
+        <w:pBdr>
+          <w:bottom w:val="single" w:color="2E5090" w:sz="6" w:space="2"/>
+        </w:pBdr>
+        <w:spacing w:after="80" w:before="240"/>
+      </w:pPr>
+      <w:r>
+        <w:rPr>
+          <w:rFonts w:ascii="Calibri" w:cs="Calibri" w:eastAsia="Calibri" w:hAnsi="Calibri"/>
+          <w:b/>
+          <w:bCs/>
+          <w:color w:val="2E5090"/>
+          <w:sz w:val="24"/>
+          <w:szCs w:val="24"/>
+        </w:rPr>
+        <w:t xml:space="preserve">CERTIFICATIONS</w:t>
       </w:r>
     </w:p>
     <w:p>

</xml_diff>